<commit_message>
updated and new files
</commit_message>
<xml_diff>
--- a/INVOICES.docx
+++ b/INVOICES.docx
@@ -34,44 +34,12 @@
           <w:b/>
           <w:bCs/>
         </w:rPr>
-        <w:t xml:space="preserve">1. Use </w:t>
-      </w:r>
-      <w:proofErr w:type="spellStart"/>
-      <w:r>
-        <w:rPr>
-          <w:b/>
-          <w:bCs/>
-        </w:rPr>
-        <w:t>Supabase</w:t>
-      </w:r>
-      <w:proofErr w:type="spellEnd"/>
-      <w:r>
-        <w:rPr>
-          <w:b/>
-          <w:bCs/>
-        </w:rPr>
-        <w:t xml:space="preserve"> as your DB</w:t>
-      </w:r>
-    </w:p>
-    <w:p>
-      <w:r>
-        <w:t>You’ll keep the same PWA (React + Vite + </w:t>
-      </w:r>
-      <w:proofErr w:type="spellStart"/>
-      <w:r>
-        <w:t>vite</w:t>
-      </w:r>
-      <w:proofErr w:type="spellEnd"/>
-      <w:r>
-        <w:t>-plugin-</w:t>
-      </w:r>
-      <w:proofErr w:type="spellStart"/>
-      <w:r>
-        <w:t>pwa</w:t>
-      </w:r>
-      <w:proofErr w:type="spellEnd"/>
-      <w:r>
-        <w:t>), but now:</w:t>
+        <w:t>1. Use Supabase as your DB</w:t>
+      </w:r>
+    </w:p>
+    <w:p>
+      <w:r>
+        <w:t>You’ll keep the same PWA (React + Vite + vite-plugin-pwa), but now:</w:t>
       </w:r>
     </w:p>
     <w:p>
@@ -82,15 +50,7 @@
         </w:numPr>
       </w:pPr>
       <w:r>
-        <w:t>customers → </w:t>
-      </w:r>
-      <w:proofErr w:type="gramStart"/>
-      <w:r>
-        <w:t>customers</w:t>
-      </w:r>
-      <w:proofErr w:type="gramEnd"/>
-      <w:r>
-        <w:t> table</w:t>
+        <w:t>customers → customers table</w:t>
       </w:r>
     </w:p>
     <w:p>
@@ -111,42 +71,20 @@
           <w:numId w:val="1"/>
         </w:numPr>
       </w:pPr>
-      <w:proofErr w:type="spellStart"/>
-      <w:r>
-        <w:t>invoice_items</w:t>
-      </w:r>
-      <w:proofErr w:type="spellEnd"/>
-      <w:r>
-        <w:t> → </w:t>
-      </w:r>
-      <w:proofErr w:type="spellStart"/>
-      <w:r>
-        <w:t>invoice_items</w:t>
-      </w:r>
-      <w:proofErr w:type="spellEnd"/>
-      <w:r>
-        <w:t> table</w:t>
+      <w:r>
+        <w:t>invoice_items → invoice_items table</w:t>
       </w:r>
     </w:p>
     <w:p>
       <w:r>
         <w:t>We’ll use </w:t>
       </w:r>
-      <w:proofErr w:type="spellStart"/>
-      <w:r>
-        <w:rPr>
-          <w:b/>
-          <w:bCs/>
-        </w:rPr>
-        <w:t>Supabase</w:t>
-      </w:r>
-      <w:proofErr w:type="spellEnd"/>
-      <w:r>
-        <w:rPr>
-          <w:b/>
-          <w:bCs/>
-        </w:rPr>
-        <w:t xml:space="preserve"> Auth + Postgres</w:t>
+      <w:r>
+        <w:rPr>
+          <w:b/>
+          <w:bCs/>
+        </w:rPr>
+        <w:t>Supabase Auth + Postgres</w:t>
       </w:r>
       <w:r>
         <w:t> so you can log in on any device and see the same data.</w:t>
@@ -189,49 +127,7 @@
         <w:rPr>
           <w:lang w:val="en-US"/>
         </w:rPr>
-        <w:t xml:space="preserve">  id </w:t>
-      </w:r>
-      <w:proofErr w:type="spellStart"/>
-      <w:r>
-        <w:rPr>
-          <w:lang w:val="en-US"/>
-        </w:rPr>
-        <w:t>uuid</w:t>
-      </w:r>
-      <w:proofErr w:type="spellEnd"/>
-      <w:r>
-        <w:rPr>
-          <w:lang w:val="en-US"/>
-        </w:rPr>
-        <w:t xml:space="preserve"> primary key default </w:t>
-      </w:r>
-      <w:proofErr w:type="spellStart"/>
-      <w:r>
-        <w:rPr>
-          <w:lang w:val="en-US"/>
-        </w:rPr>
-        <w:t>gen_random_</w:t>
-      </w:r>
-      <w:proofErr w:type="gramStart"/>
-      <w:r>
-        <w:rPr>
-          <w:lang w:val="en-US"/>
-        </w:rPr>
-        <w:t>uuid</w:t>
-      </w:r>
-      <w:proofErr w:type="spellEnd"/>
-      <w:r>
-        <w:rPr>
-          <w:lang w:val="en-US"/>
-        </w:rPr>
-        <w:t>(</w:t>
-      </w:r>
-      <w:proofErr w:type="gramEnd"/>
-      <w:r>
-        <w:rPr>
-          <w:lang w:val="en-US"/>
-        </w:rPr>
-        <w:t>),</w:t>
+        <w:t xml:space="preserve">  id uuid primary key default gen_random_uuid(),</w:t>
       </w:r>
     </w:p>
     <w:p>
@@ -296,104 +192,20 @@
         <w:rPr>
           <w:lang w:val="en-US"/>
         </w:rPr>
-        <w:t xml:space="preserve">  </w:t>
-      </w:r>
-      <w:proofErr w:type="spellStart"/>
-      <w:r>
-        <w:rPr>
-          <w:lang w:val="en-US"/>
-        </w:rPr>
-        <w:t>created_at</w:t>
-      </w:r>
-      <w:proofErr w:type="spellEnd"/>
-      <w:r>
-        <w:rPr>
-          <w:lang w:val="en-US"/>
-        </w:rPr>
-        <w:t xml:space="preserve"> </w:t>
-      </w:r>
-      <w:proofErr w:type="spellStart"/>
-      <w:r>
-        <w:rPr>
-          <w:lang w:val="en-US"/>
-        </w:rPr>
-        <w:t>timestamptz</w:t>
-      </w:r>
-      <w:proofErr w:type="spellEnd"/>
-      <w:r>
-        <w:rPr>
-          <w:lang w:val="en-US"/>
-        </w:rPr>
-        <w:t xml:space="preserve"> not null default </w:t>
-      </w:r>
-      <w:proofErr w:type="gramStart"/>
-      <w:r>
-        <w:rPr>
-          <w:lang w:val="en-US"/>
-        </w:rPr>
-        <w:t>now(</w:t>
-      </w:r>
-      <w:proofErr w:type="gramEnd"/>
-      <w:r>
-        <w:rPr>
-          <w:lang w:val="en-US"/>
-        </w:rPr>
-        <w:t>),</w:t>
-      </w:r>
-    </w:p>
-    <w:p>
-      <w:pPr>
-        <w:rPr>
-          <w:lang w:val="en-US"/>
-        </w:rPr>
-      </w:pPr>
-      <w:r>
-        <w:rPr>
-          <w:lang w:val="en-US"/>
-        </w:rPr>
-        <w:t xml:space="preserve">  </w:t>
-      </w:r>
-      <w:proofErr w:type="spellStart"/>
-      <w:r>
-        <w:rPr>
-          <w:lang w:val="en-US"/>
-        </w:rPr>
-        <w:t>updated_at</w:t>
-      </w:r>
-      <w:proofErr w:type="spellEnd"/>
-      <w:r>
-        <w:rPr>
-          <w:lang w:val="en-US"/>
-        </w:rPr>
-        <w:t xml:space="preserve"> </w:t>
-      </w:r>
-      <w:proofErr w:type="spellStart"/>
-      <w:r>
-        <w:rPr>
-          <w:lang w:val="en-US"/>
-        </w:rPr>
-        <w:t>timestamptz</w:t>
-      </w:r>
-      <w:proofErr w:type="spellEnd"/>
-      <w:r>
-        <w:rPr>
-          <w:lang w:val="en-US"/>
-        </w:rPr>
-        <w:t xml:space="preserve"> not null default </w:t>
-      </w:r>
-      <w:proofErr w:type="gramStart"/>
-      <w:r>
-        <w:rPr>
-          <w:lang w:val="en-US"/>
-        </w:rPr>
-        <w:t>now(</w:t>
-      </w:r>
-      <w:proofErr w:type="gramEnd"/>
-      <w:r>
-        <w:rPr>
-          <w:lang w:val="en-US"/>
-        </w:rPr>
-        <w:t>)</w:t>
+        <w:t xml:space="preserve">  created_at timestamptz not null default now(),</w:t>
+      </w:r>
+    </w:p>
+    <w:p>
+      <w:pPr>
+        <w:rPr>
+          <w:lang w:val="en-US"/>
+        </w:rPr>
+      </w:pPr>
+      <w:r>
+        <w:rPr>
+          <w:lang w:val="en-US"/>
+        </w:rPr>
+        <w:t xml:space="preserve">  updated_at timestamptz not null default now()</w:t>
       </w:r>
     </w:p>
     <w:p>
@@ -439,90 +251,20 @@
         <w:rPr>
           <w:lang w:val="en-US"/>
         </w:rPr>
-        <w:t xml:space="preserve">  id </w:t>
-      </w:r>
-      <w:proofErr w:type="spellStart"/>
-      <w:r>
-        <w:rPr>
-          <w:lang w:val="en-US"/>
-        </w:rPr>
-        <w:t>uuid</w:t>
-      </w:r>
-      <w:proofErr w:type="spellEnd"/>
-      <w:r>
-        <w:rPr>
-          <w:lang w:val="en-US"/>
-        </w:rPr>
-        <w:t xml:space="preserve"> primary key default </w:t>
-      </w:r>
-      <w:proofErr w:type="spellStart"/>
-      <w:r>
-        <w:rPr>
-          <w:lang w:val="en-US"/>
-        </w:rPr>
-        <w:t>gen_random_</w:t>
-      </w:r>
-      <w:proofErr w:type="gramStart"/>
-      <w:r>
-        <w:rPr>
-          <w:lang w:val="en-US"/>
-        </w:rPr>
-        <w:t>uuid</w:t>
-      </w:r>
-      <w:proofErr w:type="spellEnd"/>
-      <w:r>
-        <w:rPr>
-          <w:lang w:val="en-US"/>
-        </w:rPr>
-        <w:t>(</w:t>
-      </w:r>
-      <w:proofErr w:type="gramEnd"/>
-      <w:r>
-        <w:rPr>
-          <w:lang w:val="en-US"/>
-        </w:rPr>
-        <w:t>),</w:t>
-      </w:r>
-    </w:p>
-    <w:p>
-      <w:pPr>
-        <w:rPr>
-          <w:lang w:val="en-US"/>
-        </w:rPr>
-      </w:pPr>
-      <w:r>
-        <w:rPr>
-          <w:lang w:val="en-US"/>
-        </w:rPr>
-        <w:t xml:space="preserve">  </w:t>
-      </w:r>
-      <w:proofErr w:type="spellStart"/>
-      <w:r>
-        <w:rPr>
-          <w:lang w:val="en-US"/>
-        </w:rPr>
-        <w:t>customer_id</w:t>
-      </w:r>
-      <w:proofErr w:type="spellEnd"/>
-      <w:r>
-        <w:rPr>
-          <w:lang w:val="en-US"/>
-        </w:rPr>
-        <w:t xml:space="preserve"> </w:t>
-      </w:r>
-      <w:proofErr w:type="spellStart"/>
-      <w:r>
-        <w:rPr>
-          <w:lang w:val="en-US"/>
-        </w:rPr>
-        <w:t>uuid</w:t>
-      </w:r>
-      <w:proofErr w:type="spellEnd"/>
-      <w:r>
-        <w:rPr>
-          <w:lang w:val="en-US"/>
-        </w:rPr>
-        <w:t xml:space="preserve"> not null references customers(id),</w:t>
+        <w:t xml:space="preserve">  id uuid primary key default gen_random_uuid(),</w:t>
+      </w:r>
+    </w:p>
+    <w:p>
+      <w:pPr>
+        <w:rPr>
+          <w:lang w:val="en-US"/>
+        </w:rPr>
+      </w:pPr>
+      <w:r>
+        <w:rPr>
+          <w:lang w:val="en-US"/>
+        </w:rPr>
+        <w:t xml:space="preserve">  customer_id uuid not null references customers(id),</w:t>
       </w:r>
     </w:p>
     <w:p>
@@ -548,50 +290,20 @@
         <w:rPr>
           <w:lang w:val="en-US"/>
         </w:rPr>
-        <w:t xml:space="preserve">  date </w:t>
-      </w:r>
-      <w:proofErr w:type="spellStart"/>
-      <w:r>
-        <w:rPr>
-          <w:lang w:val="en-US"/>
-        </w:rPr>
-        <w:t>date</w:t>
-      </w:r>
-      <w:proofErr w:type="spellEnd"/>
-      <w:r>
-        <w:rPr>
-          <w:lang w:val="en-US"/>
-        </w:rPr>
-        <w:t xml:space="preserve"> not null,</w:t>
-      </w:r>
-    </w:p>
-    <w:p>
-      <w:pPr>
-        <w:rPr>
-          <w:lang w:val="en-US"/>
-        </w:rPr>
-      </w:pPr>
-      <w:r>
-        <w:rPr>
-          <w:lang w:val="en-US"/>
-        </w:rPr>
-        <w:t xml:space="preserve">  </w:t>
-      </w:r>
-      <w:proofErr w:type="spellStart"/>
-      <w:proofErr w:type="gramStart"/>
-      <w:r>
-        <w:rPr>
-          <w:lang w:val="en-US"/>
-        </w:rPr>
-        <w:t>due_date</w:t>
-      </w:r>
-      <w:proofErr w:type="spellEnd"/>
-      <w:proofErr w:type="gramEnd"/>
-      <w:r>
-        <w:rPr>
-          <w:lang w:val="en-US"/>
-        </w:rPr>
-        <w:t xml:space="preserve"> date,</w:t>
+        <w:t xml:space="preserve">  date date not null,</w:t>
+      </w:r>
+    </w:p>
+    <w:p>
+      <w:pPr>
+        <w:rPr>
+          <w:lang w:val="en-US"/>
+        </w:rPr>
+      </w:pPr>
+      <w:r>
+        <w:rPr>
+          <w:lang w:val="en-US"/>
+        </w:rPr>
+        <w:t xml:space="preserve">  due_date date,</w:t>
       </w:r>
     </w:p>
     <w:p>
@@ -617,104 +329,20 @@
         <w:rPr>
           <w:lang w:val="en-US"/>
         </w:rPr>
-        <w:t xml:space="preserve">  </w:t>
-      </w:r>
-      <w:proofErr w:type="spellStart"/>
-      <w:r>
-        <w:rPr>
-          <w:lang w:val="en-US"/>
-        </w:rPr>
-        <w:t>created_at</w:t>
-      </w:r>
-      <w:proofErr w:type="spellEnd"/>
-      <w:r>
-        <w:rPr>
-          <w:lang w:val="en-US"/>
-        </w:rPr>
-        <w:t xml:space="preserve"> </w:t>
-      </w:r>
-      <w:proofErr w:type="spellStart"/>
-      <w:r>
-        <w:rPr>
-          <w:lang w:val="en-US"/>
-        </w:rPr>
-        <w:t>timestamptz</w:t>
-      </w:r>
-      <w:proofErr w:type="spellEnd"/>
-      <w:r>
-        <w:rPr>
-          <w:lang w:val="en-US"/>
-        </w:rPr>
-        <w:t xml:space="preserve"> not null default </w:t>
-      </w:r>
-      <w:proofErr w:type="gramStart"/>
-      <w:r>
-        <w:rPr>
-          <w:lang w:val="en-US"/>
-        </w:rPr>
-        <w:t>now(</w:t>
-      </w:r>
-      <w:proofErr w:type="gramEnd"/>
-      <w:r>
-        <w:rPr>
-          <w:lang w:val="en-US"/>
-        </w:rPr>
-        <w:t>),</w:t>
-      </w:r>
-    </w:p>
-    <w:p>
-      <w:pPr>
-        <w:rPr>
-          <w:lang w:val="en-US"/>
-        </w:rPr>
-      </w:pPr>
-      <w:r>
-        <w:rPr>
-          <w:lang w:val="en-US"/>
-        </w:rPr>
-        <w:t xml:space="preserve">  </w:t>
-      </w:r>
-      <w:proofErr w:type="spellStart"/>
-      <w:r>
-        <w:rPr>
-          <w:lang w:val="en-US"/>
-        </w:rPr>
-        <w:t>updated_at</w:t>
-      </w:r>
-      <w:proofErr w:type="spellEnd"/>
-      <w:r>
-        <w:rPr>
-          <w:lang w:val="en-US"/>
-        </w:rPr>
-        <w:t xml:space="preserve"> </w:t>
-      </w:r>
-      <w:proofErr w:type="spellStart"/>
-      <w:r>
-        <w:rPr>
-          <w:lang w:val="en-US"/>
-        </w:rPr>
-        <w:t>timestamptz</w:t>
-      </w:r>
-      <w:proofErr w:type="spellEnd"/>
-      <w:r>
-        <w:rPr>
-          <w:lang w:val="en-US"/>
-        </w:rPr>
-        <w:t xml:space="preserve"> not null default </w:t>
-      </w:r>
-      <w:proofErr w:type="gramStart"/>
-      <w:r>
-        <w:rPr>
-          <w:lang w:val="en-US"/>
-        </w:rPr>
-        <w:t>now(</w:t>
-      </w:r>
-      <w:proofErr w:type="gramEnd"/>
-      <w:r>
-        <w:rPr>
-          <w:lang w:val="en-US"/>
-        </w:rPr>
-        <w:t>)</w:t>
+        <w:t xml:space="preserve">  created_at timestamptz not null default now(),</w:t>
+      </w:r>
+    </w:p>
+    <w:p>
+      <w:pPr>
+        <w:rPr>
+          <w:lang w:val="en-US"/>
+        </w:rPr>
+      </w:pPr>
+      <w:r>
+        <w:rPr>
+          <w:lang w:val="en-US"/>
+        </w:rPr>
+        <w:t xml:space="preserve">  updated_at timestamptz not null default now()</w:t>
       </w:r>
     </w:p>
     <w:p>
@@ -748,117 +376,33 @@
         <w:rPr>
           <w:lang w:val="en-US"/>
         </w:rPr>
-        <w:t xml:space="preserve">create table </w:t>
-      </w:r>
-      <w:proofErr w:type="spellStart"/>
-      <w:r>
-        <w:rPr>
-          <w:lang w:val="en-US"/>
-        </w:rPr>
-        <w:t>invoice_items</w:t>
-      </w:r>
-      <w:proofErr w:type="spellEnd"/>
-      <w:r>
-        <w:rPr>
-          <w:lang w:val="en-US"/>
-        </w:rPr>
-        <w:t xml:space="preserve"> (</w:t>
-      </w:r>
-    </w:p>
-    <w:p>
-      <w:pPr>
-        <w:rPr>
-          <w:lang w:val="en-US"/>
-        </w:rPr>
-      </w:pPr>
-      <w:r>
-        <w:rPr>
-          <w:lang w:val="en-US"/>
-        </w:rPr>
-        <w:t xml:space="preserve">  id </w:t>
-      </w:r>
-      <w:proofErr w:type="spellStart"/>
-      <w:r>
-        <w:rPr>
-          <w:lang w:val="en-US"/>
-        </w:rPr>
-        <w:t>uuid</w:t>
-      </w:r>
-      <w:proofErr w:type="spellEnd"/>
-      <w:r>
-        <w:rPr>
-          <w:lang w:val="en-US"/>
-        </w:rPr>
-        <w:t xml:space="preserve"> primary key default </w:t>
-      </w:r>
-      <w:proofErr w:type="spellStart"/>
-      <w:r>
-        <w:rPr>
-          <w:lang w:val="en-US"/>
-        </w:rPr>
-        <w:t>gen_random_</w:t>
-      </w:r>
-      <w:proofErr w:type="gramStart"/>
-      <w:r>
-        <w:rPr>
-          <w:lang w:val="en-US"/>
-        </w:rPr>
-        <w:t>uuid</w:t>
-      </w:r>
-      <w:proofErr w:type="spellEnd"/>
-      <w:r>
-        <w:rPr>
-          <w:lang w:val="en-US"/>
-        </w:rPr>
-        <w:t>(</w:t>
-      </w:r>
-      <w:proofErr w:type="gramEnd"/>
-      <w:r>
-        <w:rPr>
-          <w:lang w:val="en-US"/>
-        </w:rPr>
-        <w:t>),</w:t>
-      </w:r>
-    </w:p>
-    <w:p>
-      <w:pPr>
-        <w:rPr>
-          <w:lang w:val="en-US"/>
-        </w:rPr>
-      </w:pPr>
-      <w:r>
-        <w:rPr>
-          <w:lang w:val="en-US"/>
-        </w:rPr>
-        <w:t xml:space="preserve">  </w:t>
-      </w:r>
-      <w:proofErr w:type="spellStart"/>
-      <w:r>
-        <w:rPr>
-          <w:lang w:val="en-US"/>
-        </w:rPr>
-        <w:t>invoice_id</w:t>
-      </w:r>
-      <w:proofErr w:type="spellEnd"/>
-      <w:r>
-        <w:rPr>
-          <w:lang w:val="en-US"/>
-        </w:rPr>
-        <w:t xml:space="preserve"> </w:t>
-      </w:r>
-      <w:proofErr w:type="spellStart"/>
-      <w:r>
-        <w:rPr>
-          <w:lang w:val="en-US"/>
-        </w:rPr>
-        <w:t>uuid</w:t>
-      </w:r>
-      <w:proofErr w:type="spellEnd"/>
-      <w:r>
-        <w:rPr>
-          <w:lang w:val="en-US"/>
-        </w:rPr>
-        <w:t xml:space="preserve"> not null references invoices(id) on delete cascade,</w:t>
+        <w:t>create table invoice_items (</w:t>
+      </w:r>
+    </w:p>
+    <w:p>
+      <w:pPr>
+        <w:rPr>
+          <w:lang w:val="en-US"/>
+        </w:rPr>
+      </w:pPr>
+      <w:r>
+        <w:rPr>
+          <w:lang w:val="en-US"/>
+        </w:rPr>
+        <w:t xml:space="preserve">  id uuid primary key default gen_random_uuid(),</w:t>
+      </w:r>
+    </w:p>
+    <w:p>
+      <w:pPr>
+        <w:rPr>
+          <w:lang w:val="en-US"/>
+        </w:rPr>
+      </w:pPr>
+      <w:r>
+        <w:rPr>
+          <w:lang w:val="en-US"/>
+        </w:rPr>
+        <w:t xml:space="preserve">  invoice_id uuid not null references invoices(id) on delete cascade,</w:t>
       </w:r>
     </w:p>
     <w:p>
@@ -897,90 +441,20 @@
         <w:rPr>
           <w:lang w:val="en-US"/>
         </w:rPr>
-        <w:t xml:space="preserve">  </w:t>
-      </w:r>
-      <w:proofErr w:type="spellStart"/>
-      <w:r>
-        <w:rPr>
-          <w:lang w:val="en-US"/>
-        </w:rPr>
-        <w:t>unit_price</w:t>
-      </w:r>
-      <w:proofErr w:type="spellEnd"/>
-      <w:r>
-        <w:rPr>
-          <w:lang w:val="en-US"/>
-        </w:rPr>
-        <w:t xml:space="preserve"> numeric not null check (</w:t>
-      </w:r>
-      <w:proofErr w:type="spellStart"/>
-      <w:r>
-        <w:rPr>
-          <w:lang w:val="en-US"/>
-        </w:rPr>
-        <w:t>unit_price</w:t>
-      </w:r>
-      <w:proofErr w:type="spellEnd"/>
-      <w:r>
-        <w:rPr>
-          <w:lang w:val="en-US"/>
-        </w:rPr>
-        <w:t xml:space="preserve"> &gt;= 0),</w:t>
-      </w:r>
-    </w:p>
-    <w:p>
-      <w:pPr>
-        <w:rPr>
-          <w:lang w:val="en-US"/>
-        </w:rPr>
-      </w:pPr>
-      <w:r>
-        <w:rPr>
-          <w:lang w:val="en-US"/>
-        </w:rPr>
-        <w:t xml:space="preserve">  </w:t>
-      </w:r>
-      <w:proofErr w:type="spellStart"/>
-      <w:r>
-        <w:rPr>
-          <w:lang w:val="en-US"/>
-        </w:rPr>
-        <w:t>created_at</w:t>
-      </w:r>
-      <w:proofErr w:type="spellEnd"/>
-      <w:r>
-        <w:rPr>
-          <w:lang w:val="en-US"/>
-        </w:rPr>
-        <w:t xml:space="preserve"> </w:t>
-      </w:r>
-      <w:proofErr w:type="spellStart"/>
-      <w:r>
-        <w:rPr>
-          <w:lang w:val="en-US"/>
-        </w:rPr>
-        <w:t>timestamptz</w:t>
-      </w:r>
-      <w:proofErr w:type="spellEnd"/>
-      <w:r>
-        <w:rPr>
-          <w:lang w:val="en-US"/>
-        </w:rPr>
-        <w:t xml:space="preserve"> not null default </w:t>
-      </w:r>
-      <w:proofErr w:type="gramStart"/>
-      <w:r>
-        <w:rPr>
-          <w:lang w:val="en-US"/>
-        </w:rPr>
-        <w:t>now(</w:t>
-      </w:r>
-      <w:proofErr w:type="gramEnd"/>
-      <w:r>
-        <w:rPr>
-          <w:lang w:val="en-US"/>
-        </w:rPr>
-        <w:t>)</w:t>
+        <w:t xml:space="preserve">  unit_price numeric not null check (unit_price &gt;= 0),</w:t>
+      </w:r>
+    </w:p>
+    <w:p>
+      <w:pPr>
+        <w:rPr>
+          <w:lang w:val="en-US"/>
+        </w:rPr>
+      </w:pPr>
+      <w:r>
+        <w:rPr>
+          <w:lang w:val="en-US"/>
+        </w:rPr>
+        <w:t xml:space="preserve">  created_at timestamptz not null default now()</w:t>
       </w:r>
     </w:p>
     <w:p>
@@ -1086,23 +560,7 @@
           <w:b/>
           <w:bCs/>
         </w:rPr>
-        <w:t xml:space="preserve">Extends </w:t>
-      </w:r>
-      <w:proofErr w:type="spellStart"/>
-      <w:r>
-        <w:rPr>
-          <w:b/>
-          <w:bCs/>
-        </w:rPr>
-        <w:t>Supabase</w:t>
-      </w:r>
-      <w:proofErr w:type="spellEnd"/>
-      <w:r>
-        <w:rPr>
-          <w:b/>
-          <w:bCs/>
-        </w:rPr>
-        <w:t xml:space="preserve"> auth users</w:t>
+        <w:t>Extends Supabase auth users</w:t>
       </w:r>
     </w:p>
     <w:p>
@@ -1125,65 +583,15 @@
           <w:bCs/>
         </w:rPr>
         <w:br/>
-        <w:t xml:space="preserve">  id </w:t>
-      </w:r>
-      <w:proofErr w:type="spellStart"/>
-      <w:r>
-        <w:rPr>
-          <w:b/>
-          <w:bCs/>
-        </w:rPr>
-        <w:t>uuid</w:t>
-      </w:r>
-      <w:proofErr w:type="spellEnd"/>
-      <w:r>
-        <w:rPr>
-          <w:b/>
-          <w:bCs/>
-        </w:rPr>
-        <w:t xml:space="preserve"> primary key references </w:t>
-      </w:r>
-      <w:proofErr w:type="spellStart"/>
-      <w:proofErr w:type="gramStart"/>
-      <w:r>
-        <w:rPr>
-          <w:b/>
-          <w:bCs/>
-        </w:rPr>
-        <w:t>auth.users</w:t>
-      </w:r>
-      <w:proofErr w:type="spellEnd"/>
-      <w:proofErr w:type="gramEnd"/>
-      <w:r>
-        <w:rPr>
-          <w:b/>
-          <w:bCs/>
-        </w:rPr>
-        <w:t>(id) on delete cascade,</w:t>
-      </w:r>
-      <w:r>
-        <w:rPr>
-          <w:b/>
-          <w:bCs/>
-        </w:rPr>
-        <w:br/>
-        <w:t xml:space="preserve">  </w:t>
-      </w:r>
-      <w:proofErr w:type="spellStart"/>
-      <w:r>
-        <w:rPr>
-          <w:b/>
-          <w:bCs/>
-        </w:rPr>
-        <w:t>full_name</w:t>
-      </w:r>
-      <w:proofErr w:type="spellEnd"/>
-      <w:r>
-        <w:rPr>
-          <w:b/>
-          <w:bCs/>
-        </w:rPr>
-        <w:t xml:space="preserve"> text,</w:t>
+        <w:t xml:space="preserve">  id uuid primary key references auth.users(id) on delete cascade,</w:t>
+      </w:r>
+      <w:r>
+        <w:rPr>
+          <w:b/>
+          <w:bCs/>
+        </w:rPr>
+        <w:br/>
+        <w:t xml:space="preserve">  full_name text,</w:t>
       </w:r>
       <w:r>
         <w:rPr>
@@ -1199,39 +607,7 @@
           <w:bCs/>
         </w:rPr>
         <w:br/>
-        <w:t xml:space="preserve">  </w:t>
-      </w:r>
-      <w:proofErr w:type="spellStart"/>
-      <w:r>
-        <w:rPr>
-          <w:b/>
-          <w:bCs/>
-        </w:rPr>
-        <w:t>created_at</w:t>
-      </w:r>
-      <w:proofErr w:type="spellEnd"/>
-      <w:r>
-        <w:rPr>
-          <w:b/>
-          <w:bCs/>
-        </w:rPr>
-        <w:t xml:space="preserve"> timestamp default </w:t>
-      </w:r>
-      <w:proofErr w:type="gramStart"/>
-      <w:r>
-        <w:rPr>
-          <w:b/>
-          <w:bCs/>
-        </w:rPr>
-        <w:t>now(</w:t>
-      </w:r>
-      <w:proofErr w:type="gramEnd"/>
-      <w:r>
-        <w:rPr>
-          <w:b/>
-          <w:bCs/>
-        </w:rPr>
-        <w:t>)</w:t>
+        <w:t xml:space="preserve">  created_at timestamp default now()</w:t>
       </w:r>
       <w:r>
         <w:rPr>
@@ -1255,7 +631,7 @@
           <w:bCs/>
         </w:rPr>
         <w:pict w14:anchorId="2FCBD321">
-          <v:rect id="_x0000_i1085" style="width:0;height:1.5pt" o:hralign="center" o:hrstd="t" o:hr="t" fillcolor="#a0a0a0" stroked="f"/>
+          <v:rect id="_x0000_i1025" style="width:0;height:1.5pt" o:hralign="center" o:hrstd="t" o:hr="t" fillcolor="#a0a0a0" stroked="f"/>
         </w:pict>
       </w:r>
     </w:p>
@@ -1302,55 +678,7 @@
           <w:bCs/>
         </w:rPr>
         <w:br/>
-        <w:t xml:space="preserve">  id </w:t>
-      </w:r>
-      <w:proofErr w:type="spellStart"/>
-      <w:r>
-        <w:rPr>
-          <w:b/>
-          <w:bCs/>
-        </w:rPr>
-        <w:t>uuid</w:t>
-      </w:r>
-      <w:proofErr w:type="spellEnd"/>
-      <w:r>
-        <w:rPr>
-          <w:b/>
-          <w:bCs/>
-        </w:rPr>
-        <w:t xml:space="preserve"> primary key default </w:t>
-      </w:r>
-      <w:proofErr w:type="spellStart"/>
-      <w:r>
-        <w:rPr>
-          <w:b/>
-          <w:bCs/>
-        </w:rPr>
-        <w:t>gen_random_</w:t>
-      </w:r>
-      <w:proofErr w:type="gramStart"/>
-      <w:r>
-        <w:rPr>
-          <w:b/>
-          <w:bCs/>
-        </w:rPr>
-        <w:t>uuid</w:t>
-      </w:r>
-      <w:proofErr w:type="spellEnd"/>
-      <w:r>
-        <w:rPr>
-          <w:b/>
-          <w:bCs/>
-        </w:rPr>
-        <w:t>(</w:t>
-      </w:r>
-      <w:proofErr w:type="gramEnd"/>
-      <w:r>
-        <w:rPr>
-          <w:b/>
-          <w:bCs/>
-        </w:rPr>
-        <w:t>),</w:t>
+        <w:t xml:space="preserve">  id uuid primary key default gen_random_uuid(),</w:t>
       </w:r>
       <w:r>
         <w:rPr>
@@ -1366,79 +694,15 @@
           <w:bCs/>
         </w:rPr>
         <w:br/>
-        <w:t xml:space="preserve">  </w:t>
-      </w:r>
-      <w:proofErr w:type="spellStart"/>
-      <w:r>
-        <w:rPr>
-          <w:b/>
-          <w:bCs/>
-        </w:rPr>
-        <w:t>owner_id</w:t>
-      </w:r>
-      <w:proofErr w:type="spellEnd"/>
-      <w:r>
-        <w:rPr>
-          <w:b/>
-          <w:bCs/>
-        </w:rPr>
-        <w:t xml:space="preserve"> </w:t>
-      </w:r>
-      <w:proofErr w:type="spellStart"/>
-      <w:r>
-        <w:rPr>
-          <w:b/>
-          <w:bCs/>
-        </w:rPr>
-        <w:t>uuid</w:t>
-      </w:r>
-      <w:proofErr w:type="spellEnd"/>
-      <w:r>
-        <w:rPr>
-          <w:b/>
-          <w:bCs/>
-        </w:rPr>
-        <w:t xml:space="preserve"> references profiles(id),</w:t>
-      </w:r>
-      <w:r>
-        <w:rPr>
-          <w:b/>
-          <w:bCs/>
-        </w:rPr>
-        <w:br/>
-        <w:t xml:space="preserve">  </w:t>
-      </w:r>
-      <w:proofErr w:type="spellStart"/>
-      <w:r>
-        <w:rPr>
-          <w:b/>
-          <w:bCs/>
-        </w:rPr>
-        <w:t>created_at</w:t>
-      </w:r>
-      <w:proofErr w:type="spellEnd"/>
-      <w:r>
-        <w:rPr>
-          <w:b/>
-          <w:bCs/>
-        </w:rPr>
-        <w:t xml:space="preserve"> timestamp default </w:t>
-      </w:r>
-      <w:proofErr w:type="gramStart"/>
-      <w:r>
-        <w:rPr>
-          <w:b/>
-          <w:bCs/>
-        </w:rPr>
-        <w:t>now(</w:t>
-      </w:r>
-      <w:proofErr w:type="gramEnd"/>
-      <w:r>
-        <w:rPr>
-          <w:b/>
-          <w:bCs/>
-        </w:rPr>
-        <w:t>)</w:t>
+        <w:t xml:space="preserve">  owner_id uuid references profiles(id),</w:t>
+      </w:r>
+      <w:r>
+        <w:rPr>
+          <w:b/>
+          <w:bCs/>
+        </w:rPr>
+        <w:br/>
+        <w:t xml:space="preserve">  created_at timestamp default now()</w:t>
       </w:r>
       <w:r>
         <w:rPr>
@@ -1462,7 +726,7 @@
           <w:bCs/>
         </w:rPr>
         <w:pict w14:anchorId="396F644B">
-          <v:rect id="_x0000_i1086" style="width:0;height:1.5pt" o:hralign="center" o:hrstd="t" o:hr="t" fillcolor="#a0a0a0" stroked="f"/>
+          <v:rect id="_x0000_i1026" style="width:0;height:1.5pt" o:hralign="center" o:hrstd="t" o:hr="t" fillcolor="#a0a0a0" stroked="f"/>
         </w:pict>
       </w:r>
     </w:p>
@@ -1487,183 +751,46 @@
           <w:b/>
           <w:bCs/>
         </w:rPr>
-        <w:t xml:space="preserve"> </w:t>
-      </w:r>
-      <w:proofErr w:type="spellStart"/>
-      <w:r>
-        <w:rPr>
-          <w:b/>
-          <w:bCs/>
-        </w:rPr>
-        <w:t>organization_members</w:t>
-      </w:r>
-      <w:proofErr w:type="spellEnd"/>
-    </w:p>
-    <w:p>
-      <w:pPr>
-        <w:rPr>
-          <w:b/>
-          <w:bCs/>
-        </w:rPr>
-      </w:pPr>
-      <w:r>
-        <w:rPr>
-          <w:b/>
-          <w:bCs/>
-        </w:rPr>
-        <w:t xml:space="preserve">create table </w:t>
-      </w:r>
-      <w:proofErr w:type="spellStart"/>
-      <w:r>
-        <w:rPr>
-          <w:b/>
-          <w:bCs/>
-        </w:rPr>
-        <w:t>organization_members</w:t>
-      </w:r>
-      <w:proofErr w:type="spellEnd"/>
-      <w:r>
-        <w:rPr>
-          <w:b/>
-          <w:bCs/>
-        </w:rPr>
-        <w:t xml:space="preserve"> (</w:t>
-      </w:r>
-      <w:r>
-        <w:rPr>
-          <w:b/>
-          <w:bCs/>
-        </w:rPr>
-        <w:br/>
-        <w:t xml:space="preserve">  id </w:t>
-      </w:r>
-      <w:proofErr w:type="spellStart"/>
-      <w:r>
-        <w:rPr>
-          <w:b/>
-          <w:bCs/>
-        </w:rPr>
-        <w:t>uuid</w:t>
-      </w:r>
-      <w:proofErr w:type="spellEnd"/>
-      <w:r>
-        <w:rPr>
-          <w:b/>
-          <w:bCs/>
-        </w:rPr>
-        <w:t xml:space="preserve"> primary key default </w:t>
-      </w:r>
-      <w:proofErr w:type="spellStart"/>
-      <w:r>
-        <w:rPr>
-          <w:b/>
-          <w:bCs/>
-        </w:rPr>
-        <w:t>gen_random_</w:t>
-      </w:r>
-      <w:proofErr w:type="gramStart"/>
-      <w:r>
-        <w:rPr>
-          <w:b/>
-          <w:bCs/>
-        </w:rPr>
-        <w:t>uuid</w:t>
-      </w:r>
-      <w:proofErr w:type="spellEnd"/>
-      <w:r>
-        <w:rPr>
-          <w:b/>
-          <w:bCs/>
-        </w:rPr>
-        <w:t>(</w:t>
-      </w:r>
-      <w:proofErr w:type="gramEnd"/>
-      <w:r>
-        <w:rPr>
-          <w:b/>
-          <w:bCs/>
-        </w:rPr>
-        <w:t>),</w:t>
-      </w:r>
-      <w:r>
-        <w:rPr>
-          <w:b/>
-          <w:bCs/>
-        </w:rPr>
-        <w:br/>
-        <w:t xml:space="preserve">  </w:t>
-      </w:r>
-      <w:proofErr w:type="spellStart"/>
-      <w:r>
-        <w:rPr>
-          <w:b/>
-          <w:bCs/>
-        </w:rPr>
-        <w:t>org_id</w:t>
-      </w:r>
-      <w:proofErr w:type="spellEnd"/>
-      <w:r>
-        <w:rPr>
-          <w:b/>
-          <w:bCs/>
-        </w:rPr>
-        <w:t xml:space="preserve"> </w:t>
-      </w:r>
-      <w:proofErr w:type="spellStart"/>
-      <w:r>
-        <w:rPr>
-          <w:b/>
-          <w:bCs/>
-        </w:rPr>
-        <w:t>uuid</w:t>
-      </w:r>
-      <w:proofErr w:type="spellEnd"/>
-      <w:r>
-        <w:rPr>
-          <w:b/>
-          <w:bCs/>
-        </w:rPr>
-        <w:t xml:space="preserve"> references organizations(id) on delete cascade,</w:t>
-      </w:r>
-      <w:r>
-        <w:rPr>
-          <w:b/>
-          <w:bCs/>
-        </w:rPr>
-        <w:br/>
-        <w:t xml:space="preserve">  </w:t>
-      </w:r>
-      <w:proofErr w:type="spellStart"/>
-      <w:r>
-        <w:rPr>
-          <w:b/>
-          <w:bCs/>
-        </w:rPr>
-        <w:t>user_id</w:t>
-      </w:r>
-      <w:proofErr w:type="spellEnd"/>
-      <w:r>
-        <w:rPr>
-          <w:b/>
-          <w:bCs/>
-        </w:rPr>
-        <w:t xml:space="preserve"> </w:t>
-      </w:r>
-      <w:proofErr w:type="spellStart"/>
-      <w:r>
-        <w:rPr>
-          <w:b/>
-          <w:bCs/>
-        </w:rPr>
-        <w:t>uuid</w:t>
-      </w:r>
-      <w:proofErr w:type="spellEnd"/>
-      <w:r>
-        <w:rPr>
-          <w:b/>
-          <w:bCs/>
-        </w:rPr>
-        <w:t xml:space="preserve"> references profiles(id) on delete cascade,</w:t>
+        <w:t xml:space="preserve"> organization_members</w:t>
+      </w:r>
+    </w:p>
+    <w:p>
+      <w:pPr>
+        <w:rPr>
+          <w:b/>
+          <w:bCs/>
+        </w:rPr>
+      </w:pPr>
+      <w:r>
+        <w:rPr>
+          <w:b/>
+          <w:bCs/>
+        </w:rPr>
+        <w:t>create table organization_members (</w:t>
+      </w:r>
+      <w:r>
+        <w:rPr>
+          <w:b/>
+          <w:bCs/>
+        </w:rPr>
+        <w:br/>
+        <w:t xml:space="preserve">  id uuid primary key default gen_random_uuid(),</w:t>
+      </w:r>
+      <w:r>
+        <w:rPr>
+          <w:b/>
+          <w:bCs/>
+        </w:rPr>
+        <w:br/>
+        <w:t xml:space="preserve">  org_id uuid references organizations(id) on delete cascade,</w:t>
+      </w:r>
+      <w:r>
+        <w:rPr>
+          <w:b/>
+          <w:bCs/>
+        </w:rPr>
+        <w:br/>
+        <w:t xml:space="preserve">  user_id uuid references profiles(id) on delete cascade,</w:t>
       </w:r>
       <w:r>
         <w:rPr>
@@ -1679,39 +806,7 @@
           <w:bCs/>
         </w:rPr>
         <w:br/>
-        <w:t xml:space="preserve">  </w:t>
-      </w:r>
-      <w:proofErr w:type="spellStart"/>
-      <w:r>
-        <w:rPr>
-          <w:b/>
-          <w:bCs/>
-        </w:rPr>
-        <w:t>created_at</w:t>
-      </w:r>
-      <w:proofErr w:type="spellEnd"/>
-      <w:r>
-        <w:rPr>
-          <w:b/>
-          <w:bCs/>
-        </w:rPr>
-        <w:t xml:space="preserve"> timestamp default </w:t>
-      </w:r>
-      <w:proofErr w:type="gramStart"/>
-      <w:r>
-        <w:rPr>
-          <w:b/>
-          <w:bCs/>
-        </w:rPr>
-        <w:t>now(</w:t>
-      </w:r>
-      <w:proofErr w:type="gramEnd"/>
-      <w:r>
-        <w:rPr>
-          <w:b/>
-          <w:bCs/>
-        </w:rPr>
-        <w:t>)</w:t>
+        <w:t xml:space="preserve">  created_at timestamp default now()</w:t>
       </w:r>
       <w:r>
         <w:rPr>
@@ -1735,7 +830,7 @@
           <w:bCs/>
         </w:rPr>
         <w:pict w14:anchorId="016759C8">
-          <v:rect id="_x0000_i1087" style="width:0;height:1.5pt" o:hralign="center" o:hrstd="t" o:hr="t" fillcolor="#a0a0a0" stroked="f"/>
+          <v:rect id="_x0000_i1027" style="width:0;height:1.5pt" o:hralign="center" o:hrstd="t" o:hr="t" fillcolor="#a0a0a0" stroked="f"/>
         </w:pict>
       </w:r>
     </w:p>
@@ -1797,158 +892,46 @@
           <w:bCs/>
         </w:rPr>
         <w:br/>
-        <w:t xml:space="preserve">  id </w:t>
-      </w:r>
-      <w:proofErr w:type="spellStart"/>
-      <w:r>
-        <w:rPr>
-          <w:b/>
-          <w:bCs/>
-        </w:rPr>
-        <w:t>uuid</w:t>
-      </w:r>
-      <w:proofErr w:type="spellEnd"/>
-      <w:r>
-        <w:rPr>
-          <w:b/>
-          <w:bCs/>
-        </w:rPr>
-        <w:t xml:space="preserve"> primary key default </w:t>
-      </w:r>
-      <w:proofErr w:type="spellStart"/>
-      <w:r>
-        <w:rPr>
-          <w:b/>
-          <w:bCs/>
-        </w:rPr>
-        <w:t>gen_random_uuid</w:t>
-      </w:r>
-      <w:proofErr w:type="spellEnd"/>
-      <w:r>
-        <w:rPr>
-          <w:b/>
-          <w:bCs/>
-        </w:rPr>
-        <w:t>(),</w:t>
-      </w:r>
-      <w:r>
-        <w:rPr>
-          <w:b/>
-          <w:bCs/>
-        </w:rPr>
-        <w:br/>
-        <w:t xml:space="preserve">  </w:t>
-      </w:r>
-      <w:proofErr w:type="spellStart"/>
-      <w:r>
-        <w:rPr>
-          <w:b/>
-          <w:bCs/>
-        </w:rPr>
-        <w:t>org_id</w:t>
-      </w:r>
-      <w:proofErr w:type="spellEnd"/>
-      <w:r>
-        <w:rPr>
-          <w:b/>
-          <w:bCs/>
-        </w:rPr>
-        <w:t xml:space="preserve"> </w:t>
-      </w:r>
-      <w:proofErr w:type="spellStart"/>
-      <w:r>
-        <w:rPr>
-          <w:b/>
-          <w:bCs/>
-        </w:rPr>
-        <w:t>uuid</w:t>
-      </w:r>
-      <w:proofErr w:type="spellEnd"/>
-      <w:r>
-        <w:rPr>
-          <w:b/>
-          <w:bCs/>
-        </w:rPr>
-        <w:t xml:space="preserve"> references organizations(id) on delete cascade,</w:t>
-      </w:r>
-      <w:r>
-        <w:rPr>
-          <w:b/>
-          <w:bCs/>
-        </w:rPr>
-        <w:br/>
-      </w:r>
-      <w:r>
-        <w:rPr>
-          <w:b/>
-          <w:bCs/>
-        </w:rPr>
-        <w:br/>
-        <w:t xml:space="preserve">  </w:t>
-      </w:r>
-      <w:proofErr w:type="spellStart"/>
-      <w:r>
-        <w:rPr>
-          <w:b/>
-          <w:bCs/>
-        </w:rPr>
-        <w:t>invoice_number</w:t>
-      </w:r>
-      <w:proofErr w:type="spellEnd"/>
-      <w:r>
-        <w:rPr>
-          <w:b/>
-          <w:bCs/>
-        </w:rPr>
-        <w:t xml:space="preserve"> text,</w:t>
-      </w:r>
-      <w:r>
-        <w:rPr>
-          <w:b/>
-          <w:bCs/>
-        </w:rPr>
-        <w:br/>
-        <w:t xml:space="preserve">  </w:t>
-      </w:r>
-      <w:proofErr w:type="spellStart"/>
-      <w:r>
-        <w:rPr>
-          <w:b/>
-          <w:bCs/>
-        </w:rPr>
-        <w:t>client_name</w:t>
-      </w:r>
-      <w:proofErr w:type="spellEnd"/>
-      <w:r>
-        <w:rPr>
-          <w:b/>
-          <w:bCs/>
-        </w:rPr>
-        <w:t xml:space="preserve"> text,</w:t>
-      </w:r>
-      <w:r>
-        <w:rPr>
-          <w:b/>
-          <w:bCs/>
-        </w:rPr>
-        <w:br/>
-        <w:t xml:space="preserve">  </w:t>
-      </w:r>
-      <w:proofErr w:type="spellStart"/>
-      <w:r>
-        <w:rPr>
-          <w:b/>
-          <w:bCs/>
-        </w:rPr>
-        <w:t>client_email</w:t>
-      </w:r>
-      <w:proofErr w:type="spellEnd"/>
-      <w:r>
-        <w:rPr>
-          <w:b/>
-          <w:bCs/>
-        </w:rPr>
-        <w:t xml:space="preserve"> text,</w:t>
+        <w:t xml:space="preserve">  id uuid primary key default gen_random_uuid(),</w:t>
+      </w:r>
+      <w:r>
+        <w:rPr>
+          <w:b/>
+          <w:bCs/>
+        </w:rPr>
+        <w:br/>
+        <w:t xml:space="preserve">  org_id uuid references organizations(id) on delete cascade,</w:t>
+      </w:r>
+      <w:r>
+        <w:rPr>
+          <w:b/>
+          <w:bCs/>
+        </w:rPr>
+        <w:br/>
+      </w:r>
+      <w:r>
+        <w:rPr>
+          <w:b/>
+          <w:bCs/>
+        </w:rPr>
+        <w:br/>
+        <w:t xml:space="preserve">  invoice_number text,</w:t>
+      </w:r>
+      <w:r>
+        <w:rPr>
+          <w:b/>
+          <w:bCs/>
+        </w:rPr>
+        <w:br/>
+        <w:t xml:space="preserve">  client_name text,</w:t>
+      </w:r>
+      <w:r>
+        <w:rPr>
+          <w:b/>
+          <w:bCs/>
+        </w:rPr>
+        <w:br/>
+        <w:t xml:space="preserve">  client_email text,</w:t>
       </w:r>
       <w:r>
         <w:rPr>
@@ -1971,47 +954,15 @@
           <w:bCs/>
         </w:rPr>
         <w:br/>
-        <w:t xml:space="preserve">  </w:t>
-      </w:r>
-      <w:proofErr w:type="spellStart"/>
-      <w:r>
-        <w:rPr>
-          <w:b/>
-          <w:bCs/>
-        </w:rPr>
-        <w:t>issue_date</w:t>
-      </w:r>
-      <w:proofErr w:type="spellEnd"/>
-      <w:r>
-        <w:rPr>
-          <w:b/>
-          <w:bCs/>
-        </w:rPr>
-        <w:t xml:space="preserve"> date,</w:t>
-      </w:r>
-      <w:r>
-        <w:rPr>
-          <w:b/>
-          <w:bCs/>
-        </w:rPr>
-        <w:br/>
-        <w:t xml:space="preserve">  </w:t>
-      </w:r>
-      <w:proofErr w:type="spellStart"/>
-      <w:r>
-        <w:rPr>
-          <w:b/>
-          <w:bCs/>
-        </w:rPr>
-        <w:t>due_date</w:t>
-      </w:r>
-      <w:proofErr w:type="spellEnd"/>
-      <w:r>
-        <w:rPr>
-          <w:b/>
-          <w:bCs/>
-        </w:rPr>
-        <w:t xml:space="preserve"> date,</w:t>
+        <w:t xml:space="preserve">  issue_date date,</w:t>
+      </w:r>
+      <w:r>
+        <w:rPr>
+          <w:b/>
+          <w:bCs/>
+        </w:rPr>
+        <w:br/>
+        <w:t xml:space="preserve">  due_date date,</w:t>
       </w:r>
       <w:r>
         <w:rPr>
@@ -2057,23 +1008,7 @@
           <w:bCs/>
         </w:rPr>
         <w:br/>
-        <w:t xml:space="preserve">  </w:t>
-      </w:r>
-      <w:proofErr w:type="spellStart"/>
-      <w:r>
-        <w:rPr>
-          <w:b/>
-          <w:bCs/>
-        </w:rPr>
-        <w:t>created_at</w:t>
-      </w:r>
-      <w:proofErr w:type="spellEnd"/>
-      <w:r>
-        <w:rPr>
-          <w:b/>
-          <w:bCs/>
-        </w:rPr>
-        <w:t xml:space="preserve"> timestamp default now()</w:t>
+        <w:t xml:space="preserve">  created_at timestamp default now()</w:t>
       </w:r>
       <w:r>
         <w:rPr>
@@ -2097,7 +1032,7 @@
           <w:bCs/>
         </w:rPr>
         <w:pict w14:anchorId="74EBFA89">
-          <v:rect id="_x0000_i1088" style="width:0;height:1.5pt" o:hralign="center" o:hrstd="t" o:hr="t" fillcolor="#a0a0a0" stroked="f"/>
+          <v:rect id="_x0000_i1028" style="width:0;height:1.5pt" o:hralign="center" o:hrstd="t" o:hr="t" fillcolor="#a0a0a0" stroked="f"/>
         </w:pict>
       </w:r>
     </w:p>
@@ -2108,7 +1043,6 @@
           <w:bCs/>
         </w:rPr>
       </w:pPr>
-      <w:proofErr w:type="spellStart"/>
       <w:r>
         <w:rPr>
           <w:b/>
@@ -2116,133 +1050,36 @@
         </w:rPr>
         <w:t>invoice_items</w:t>
       </w:r>
-      <w:proofErr w:type="spellEnd"/>
-    </w:p>
-    <w:p>
-      <w:pPr>
-        <w:rPr>
-          <w:b/>
-          <w:bCs/>
-        </w:rPr>
-      </w:pPr>
-      <w:r>
-        <w:rPr>
-          <w:b/>
-          <w:bCs/>
-        </w:rPr>
-        <w:t xml:space="preserve">create table </w:t>
-      </w:r>
-      <w:proofErr w:type="spellStart"/>
-      <w:r>
-        <w:rPr>
-          <w:b/>
-          <w:bCs/>
-        </w:rPr>
-        <w:t>invoice_items</w:t>
-      </w:r>
-      <w:proofErr w:type="spellEnd"/>
-      <w:r>
-        <w:rPr>
-          <w:b/>
-          <w:bCs/>
-        </w:rPr>
-        <w:t xml:space="preserve"> (</w:t>
-      </w:r>
-      <w:r>
-        <w:rPr>
-          <w:b/>
-          <w:bCs/>
-        </w:rPr>
-        <w:br/>
-        <w:t xml:space="preserve">  id </w:t>
-      </w:r>
-      <w:proofErr w:type="spellStart"/>
-      <w:r>
-        <w:rPr>
-          <w:b/>
-          <w:bCs/>
-        </w:rPr>
-        <w:t>uuid</w:t>
-      </w:r>
-      <w:proofErr w:type="spellEnd"/>
-      <w:r>
-        <w:rPr>
-          <w:b/>
-          <w:bCs/>
-        </w:rPr>
-        <w:t xml:space="preserve"> primary key default </w:t>
-      </w:r>
-      <w:proofErr w:type="spellStart"/>
-      <w:r>
-        <w:rPr>
-          <w:b/>
-          <w:bCs/>
-        </w:rPr>
-        <w:t>gen_random_</w:t>
-      </w:r>
-      <w:proofErr w:type="gramStart"/>
-      <w:r>
-        <w:rPr>
-          <w:b/>
-          <w:bCs/>
-        </w:rPr>
-        <w:t>uuid</w:t>
-      </w:r>
-      <w:proofErr w:type="spellEnd"/>
-      <w:r>
-        <w:rPr>
-          <w:b/>
-          <w:bCs/>
-        </w:rPr>
-        <w:t>(</w:t>
-      </w:r>
-      <w:proofErr w:type="gramEnd"/>
-      <w:r>
-        <w:rPr>
-          <w:b/>
-          <w:bCs/>
-        </w:rPr>
-        <w:t>),</w:t>
-      </w:r>
-      <w:r>
-        <w:rPr>
-          <w:b/>
-          <w:bCs/>
-        </w:rPr>
-        <w:br/>
-        <w:t xml:space="preserve">  </w:t>
-      </w:r>
-      <w:proofErr w:type="spellStart"/>
-      <w:r>
-        <w:rPr>
-          <w:b/>
-          <w:bCs/>
-        </w:rPr>
-        <w:t>invoice_id</w:t>
-      </w:r>
-      <w:proofErr w:type="spellEnd"/>
-      <w:r>
-        <w:rPr>
-          <w:b/>
-          <w:bCs/>
-        </w:rPr>
-        <w:t xml:space="preserve"> </w:t>
-      </w:r>
-      <w:proofErr w:type="spellStart"/>
-      <w:r>
-        <w:rPr>
-          <w:b/>
-          <w:bCs/>
-        </w:rPr>
-        <w:t>uuid</w:t>
-      </w:r>
-      <w:proofErr w:type="spellEnd"/>
-      <w:r>
-        <w:rPr>
-          <w:b/>
-          <w:bCs/>
-        </w:rPr>
-        <w:t xml:space="preserve"> references invoices(id) on delete cascade,</w:t>
+    </w:p>
+    <w:p>
+      <w:pPr>
+        <w:rPr>
+          <w:b/>
+          <w:bCs/>
+        </w:rPr>
+      </w:pPr>
+      <w:r>
+        <w:rPr>
+          <w:b/>
+          <w:bCs/>
+        </w:rPr>
+        <w:t>create table invoice_items (</w:t>
+      </w:r>
+      <w:r>
+        <w:rPr>
+          <w:b/>
+          <w:bCs/>
+        </w:rPr>
+        <w:br/>
+        <w:t xml:space="preserve">  id uuid primary key default gen_random_uuid(),</w:t>
+      </w:r>
+      <w:r>
+        <w:rPr>
+          <w:b/>
+          <w:bCs/>
+        </w:rPr>
+        <w:br/>
+        <w:t xml:space="preserve">  invoice_id uuid references invoices(id) on delete cascade,</w:t>
       </w:r>
       <w:r>
         <w:rPr>
@@ -2306,7 +1143,7 @@
         </w:rPr>
         <w:lastRenderedPageBreak/>
         <w:pict w14:anchorId="1BF75268">
-          <v:rect id="_x0000_i1089" style="width:0;height:1.5pt" o:hralign="center" o:hrstd="t" o:hr="t" fillcolor="#a0a0a0" stroked="f"/>
+          <v:rect id="_x0000_i1029" style="width:0;height:1.5pt" o:hralign="center" o:hrstd="t" o:hr="t" fillcolor="#a0a0a0" stroked="f"/>
         </w:pict>
       </w:r>
     </w:p>
@@ -2360,340 +1197,116 @@
           <w:b/>
           <w:bCs/>
         </w:rPr>
-        <w:t xml:space="preserve">create table </w:t>
-      </w:r>
-      <w:proofErr w:type="spellStart"/>
-      <w:r>
-        <w:rPr>
-          <w:b/>
-          <w:bCs/>
-        </w:rPr>
-        <w:t>organization_settings</w:t>
-      </w:r>
-      <w:proofErr w:type="spellEnd"/>
-      <w:r>
-        <w:rPr>
-          <w:b/>
-          <w:bCs/>
-        </w:rPr>
-        <w:t xml:space="preserve"> (</w:t>
-      </w:r>
-      <w:r>
-        <w:rPr>
-          <w:b/>
-          <w:bCs/>
-        </w:rPr>
-        <w:br/>
-        <w:t xml:space="preserve">  id </w:t>
-      </w:r>
-      <w:proofErr w:type="spellStart"/>
-      <w:r>
-        <w:rPr>
-          <w:b/>
-          <w:bCs/>
-        </w:rPr>
-        <w:t>uuid</w:t>
-      </w:r>
-      <w:proofErr w:type="spellEnd"/>
-      <w:r>
-        <w:rPr>
-          <w:b/>
-          <w:bCs/>
-        </w:rPr>
-        <w:t xml:space="preserve"> primary key default </w:t>
-      </w:r>
-      <w:proofErr w:type="spellStart"/>
-      <w:r>
-        <w:rPr>
-          <w:b/>
-          <w:bCs/>
-        </w:rPr>
-        <w:t>gen_random_uuid</w:t>
-      </w:r>
-      <w:proofErr w:type="spellEnd"/>
-      <w:r>
-        <w:rPr>
-          <w:b/>
-          <w:bCs/>
-        </w:rPr>
-        <w:t>(),</w:t>
-      </w:r>
-      <w:r>
-        <w:rPr>
-          <w:b/>
-          <w:bCs/>
-        </w:rPr>
-        <w:br/>
-        <w:t xml:space="preserve">  </w:t>
-      </w:r>
-      <w:proofErr w:type="spellStart"/>
-      <w:r>
-        <w:rPr>
-          <w:b/>
-          <w:bCs/>
-        </w:rPr>
-        <w:t>org_id</w:t>
-      </w:r>
-      <w:proofErr w:type="spellEnd"/>
-      <w:r>
-        <w:rPr>
-          <w:b/>
-          <w:bCs/>
-        </w:rPr>
-        <w:t xml:space="preserve"> </w:t>
-      </w:r>
-      <w:proofErr w:type="spellStart"/>
-      <w:r>
-        <w:rPr>
-          <w:b/>
-          <w:bCs/>
-        </w:rPr>
-        <w:t>uuid</w:t>
-      </w:r>
-      <w:proofErr w:type="spellEnd"/>
-      <w:r>
-        <w:rPr>
-          <w:b/>
-          <w:bCs/>
-        </w:rPr>
-        <w:t xml:space="preserve"> references organizations(id) on delete cascade,</w:t>
-      </w:r>
-      <w:r>
-        <w:rPr>
-          <w:b/>
-          <w:bCs/>
-        </w:rPr>
-        <w:br/>
-      </w:r>
-      <w:r>
-        <w:rPr>
-          <w:b/>
-          <w:bCs/>
-        </w:rPr>
-        <w:br/>
-        <w:t xml:space="preserve">  </w:t>
-      </w:r>
-      <w:proofErr w:type="spellStart"/>
-      <w:r>
-        <w:rPr>
-          <w:b/>
-          <w:bCs/>
-        </w:rPr>
-        <w:t>company_name</w:t>
-      </w:r>
-      <w:proofErr w:type="spellEnd"/>
-      <w:r>
-        <w:rPr>
-          <w:b/>
-          <w:bCs/>
-        </w:rPr>
-        <w:t xml:space="preserve"> text,</w:t>
-      </w:r>
-      <w:r>
-        <w:rPr>
-          <w:b/>
-          <w:bCs/>
-        </w:rPr>
-        <w:br/>
-        <w:t xml:space="preserve">  </w:t>
-      </w:r>
-      <w:proofErr w:type="spellStart"/>
-      <w:r>
-        <w:rPr>
-          <w:b/>
-          <w:bCs/>
-        </w:rPr>
-        <w:t>company_address</w:t>
-      </w:r>
-      <w:proofErr w:type="spellEnd"/>
-      <w:r>
-        <w:rPr>
-          <w:b/>
-          <w:bCs/>
-        </w:rPr>
-        <w:t xml:space="preserve"> text,</w:t>
-      </w:r>
-      <w:r>
-        <w:rPr>
-          <w:b/>
-          <w:bCs/>
-        </w:rPr>
-        <w:br/>
-        <w:t xml:space="preserve">  </w:t>
-      </w:r>
-      <w:proofErr w:type="spellStart"/>
-      <w:r>
-        <w:rPr>
-          <w:b/>
-          <w:bCs/>
-        </w:rPr>
-        <w:t>company_city</w:t>
-      </w:r>
-      <w:proofErr w:type="spellEnd"/>
-      <w:r>
-        <w:rPr>
-          <w:b/>
-          <w:bCs/>
-        </w:rPr>
-        <w:t xml:space="preserve"> text,</w:t>
-      </w:r>
-      <w:r>
-        <w:rPr>
-          <w:b/>
-          <w:bCs/>
-        </w:rPr>
-        <w:br/>
-        <w:t xml:space="preserve">  </w:t>
-      </w:r>
-      <w:proofErr w:type="spellStart"/>
-      <w:r>
-        <w:rPr>
-          <w:b/>
-          <w:bCs/>
-        </w:rPr>
-        <w:t>company_phone</w:t>
-      </w:r>
-      <w:proofErr w:type="spellEnd"/>
-      <w:r>
-        <w:rPr>
-          <w:b/>
-          <w:bCs/>
-        </w:rPr>
-        <w:t xml:space="preserve"> text,</w:t>
-      </w:r>
-      <w:r>
-        <w:rPr>
-          <w:b/>
-          <w:bCs/>
-        </w:rPr>
-        <w:br/>
-        <w:t xml:space="preserve">  </w:t>
-      </w:r>
-      <w:proofErr w:type="spellStart"/>
-      <w:r>
-        <w:rPr>
-          <w:b/>
-          <w:bCs/>
-        </w:rPr>
-        <w:t>company_email</w:t>
-      </w:r>
-      <w:proofErr w:type="spellEnd"/>
-      <w:r>
-        <w:rPr>
-          <w:b/>
-          <w:bCs/>
-        </w:rPr>
-        <w:t xml:space="preserve"> text,</w:t>
-      </w:r>
-      <w:r>
-        <w:rPr>
-          <w:b/>
-          <w:bCs/>
-        </w:rPr>
-        <w:br/>
-        <w:t xml:space="preserve">  </w:t>
-      </w:r>
-      <w:proofErr w:type="spellStart"/>
-      <w:r>
-        <w:rPr>
-          <w:b/>
-          <w:bCs/>
-        </w:rPr>
-        <w:t>logo_url</w:t>
-      </w:r>
-      <w:proofErr w:type="spellEnd"/>
-      <w:r>
-        <w:rPr>
-          <w:b/>
-          <w:bCs/>
-        </w:rPr>
-        <w:t xml:space="preserve"> text,</w:t>
-      </w:r>
-      <w:r>
-        <w:rPr>
-          <w:b/>
-          <w:bCs/>
-        </w:rPr>
-        <w:br/>
-      </w:r>
-      <w:r>
-        <w:rPr>
-          <w:b/>
-          <w:bCs/>
-        </w:rPr>
-        <w:br/>
-        <w:t xml:space="preserve">  </w:t>
-      </w:r>
-      <w:proofErr w:type="spellStart"/>
-      <w:r>
-        <w:rPr>
-          <w:b/>
-          <w:bCs/>
-        </w:rPr>
-        <w:t>invoice_prefix</w:t>
-      </w:r>
-      <w:proofErr w:type="spellEnd"/>
-      <w:r>
-        <w:rPr>
-          <w:b/>
-          <w:bCs/>
-        </w:rPr>
-        <w:t xml:space="preserve"> text default 'INV-',</w:t>
-      </w:r>
-      <w:r>
-        <w:rPr>
-          <w:b/>
-          <w:bCs/>
-        </w:rPr>
-        <w:br/>
-        <w:t xml:space="preserve">  </w:t>
-      </w:r>
-      <w:proofErr w:type="spellStart"/>
-      <w:r>
-        <w:rPr>
-          <w:b/>
-          <w:bCs/>
-        </w:rPr>
-        <w:t>tax_rate</w:t>
-      </w:r>
-      <w:proofErr w:type="spellEnd"/>
-      <w:r>
-        <w:rPr>
-          <w:b/>
-          <w:bCs/>
-        </w:rPr>
-        <w:t xml:space="preserve"> numeric default 0,</w:t>
-      </w:r>
-      <w:r>
-        <w:rPr>
-          <w:b/>
-          <w:bCs/>
-        </w:rPr>
-        <w:br/>
-      </w:r>
-      <w:r>
-        <w:rPr>
-          <w:b/>
-          <w:bCs/>
-        </w:rPr>
-        <w:br/>
-        <w:t xml:space="preserve">  </w:t>
-      </w:r>
-      <w:proofErr w:type="spellStart"/>
-      <w:r>
-        <w:rPr>
-          <w:b/>
-          <w:bCs/>
-        </w:rPr>
-        <w:t>updated_at</w:t>
-      </w:r>
-      <w:proofErr w:type="spellEnd"/>
-      <w:r>
-        <w:rPr>
-          <w:b/>
-          <w:bCs/>
-        </w:rPr>
-        <w:t xml:space="preserve"> timestamp default now()</w:t>
+        <w:t>create table organization_settings (</w:t>
+      </w:r>
+      <w:r>
+        <w:rPr>
+          <w:b/>
+          <w:bCs/>
+        </w:rPr>
+        <w:br/>
+        <w:t xml:space="preserve">  id uuid primary key default gen_random_uuid(),</w:t>
+      </w:r>
+      <w:r>
+        <w:rPr>
+          <w:b/>
+          <w:bCs/>
+        </w:rPr>
+        <w:br/>
+        <w:t xml:space="preserve">  org_id uuid references organizations(id) on delete cascade,</w:t>
+      </w:r>
+      <w:r>
+        <w:rPr>
+          <w:b/>
+          <w:bCs/>
+        </w:rPr>
+        <w:br/>
+      </w:r>
+      <w:r>
+        <w:rPr>
+          <w:b/>
+          <w:bCs/>
+        </w:rPr>
+        <w:br/>
+        <w:t xml:space="preserve">  company_name text,</w:t>
+      </w:r>
+      <w:r>
+        <w:rPr>
+          <w:b/>
+          <w:bCs/>
+        </w:rPr>
+        <w:br/>
+        <w:t xml:space="preserve">  company_address text,</w:t>
+      </w:r>
+      <w:r>
+        <w:rPr>
+          <w:b/>
+          <w:bCs/>
+        </w:rPr>
+        <w:br/>
+        <w:t xml:space="preserve">  company_city text,</w:t>
+      </w:r>
+      <w:r>
+        <w:rPr>
+          <w:b/>
+          <w:bCs/>
+        </w:rPr>
+        <w:br/>
+        <w:t xml:space="preserve">  company_phone text,</w:t>
+      </w:r>
+      <w:r>
+        <w:rPr>
+          <w:b/>
+          <w:bCs/>
+        </w:rPr>
+        <w:br/>
+        <w:t xml:space="preserve">  company_email text,</w:t>
+      </w:r>
+      <w:r>
+        <w:rPr>
+          <w:b/>
+          <w:bCs/>
+        </w:rPr>
+        <w:br/>
+        <w:t xml:space="preserve">  logo_url text,</w:t>
+      </w:r>
+      <w:r>
+        <w:rPr>
+          <w:b/>
+          <w:bCs/>
+        </w:rPr>
+        <w:br/>
+      </w:r>
+      <w:r>
+        <w:rPr>
+          <w:b/>
+          <w:bCs/>
+        </w:rPr>
+        <w:br/>
+        <w:t xml:space="preserve">  invoice_prefix text default 'INV-',</w:t>
+      </w:r>
+      <w:r>
+        <w:rPr>
+          <w:b/>
+          <w:bCs/>
+        </w:rPr>
+        <w:br/>
+        <w:t xml:space="preserve">  tax_rate numeric default 0,</w:t>
+      </w:r>
+      <w:r>
+        <w:rPr>
+          <w:b/>
+          <w:bCs/>
+        </w:rPr>
+        <w:br/>
+      </w:r>
+      <w:r>
+        <w:rPr>
+          <w:b/>
+          <w:bCs/>
+        </w:rPr>
+        <w:br/>
+        <w:t xml:space="preserve">  updated_at timestamp default now()</w:t>
       </w:r>
       <w:r>
         <w:rPr>
@@ -2740,7 +1353,7 @@
           <w:bCs/>
         </w:rPr>
         <w:pict w14:anchorId="7A212FBA">
-          <v:rect id="_x0000_i1090" style="width:0;height:1.5pt" o:hralign="center" o:hrstd="t" o:hr="t" fillcolor="#a0a0a0" stroked="f"/>
+          <v:rect id="_x0000_i1030" style="width:0;height:1.5pt" o:hralign="center" o:hrstd="t" o:hr="t" fillcolor="#a0a0a0" stroked="f"/>
         </w:pict>
       </w:r>
     </w:p>
@@ -2795,7 +1408,7 @@
           <w:bCs/>
         </w:rPr>
         <w:pict w14:anchorId="6630EB81">
-          <v:rect id="_x0000_i1091" style="width:0;height:1.5pt" o:hralign="center" o:hrstd="t" o:hr="t" fillcolor="#a0a0a0" stroked="f"/>
+          <v:rect id="_x0000_i1031" style="width:0;height:1.5pt" o:hralign="center" o:hrstd="t" o:hr="t" fillcolor="#a0a0a0" stroked="f"/>
         </w:pict>
       </w:r>
     </w:p>
@@ -2857,32 +1470,7 @@
           <w:bCs/>
         </w:rPr>
         <w:br/>
-        <w:t>using (</w:t>
-      </w:r>
-      <w:proofErr w:type="spellStart"/>
-      <w:proofErr w:type="gramStart"/>
-      <w:r>
-        <w:rPr>
-          <w:b/>
-          <w:bCs/>
-        </w:rPr>
-        <w:t>auth.uid</w:t>
-      </w:r>
-      <w:proofErr w:type="spellEnd"/>
-      <w:r>
-        <w:rPr>
-          <w:b/>
-          <w:bCs/>
-        </w:rPr>
-        <w:t>(</w:t>
-      </w:r>
-      <w:proofErr w:type="gramEnd"/>
-      <w:r>
-        <w:rPr>
-          <w:b/>
-          <w:bCs/>
-        </w:rPr>
-        <w:t>) = id);</w:t>
+        <w:t>using (auth.uid() = id);</w:t>
       </w:r>
     </w:p>
     <w:p>
@@ -2898,7 +1486,7 @@
           <w:bCs/>
         </w:rPr>
         <w:pict w14:anchorId="7DC7944B">
-          <v:rect id="_x0000_i1092" style="width:0;height:1.5pt" o:hralign="center" o:hrstd="t" o:hr="t" fillcolor="#a0a0a0" stroked="f"/>
+          <v:rect id="_x0000_i1032" style="width:0;height:1.5pt" o:hralign="center" o:hrstd="t" o:hr="t" fillcolor="#a0a0a0" stroked="f"/>
         </w:pict>
       </w:r>
     </w:p>
@@ -2983,81 +1571,15 @@
           <w:bCs/>
         </w:rPr>
         <w:br/>
-        <w:t xml:space="preserve">    select </w:t>
-      </w:r>
-      <w:proofErr w:type="spellStart"/>
-      <w:r>
-        <w:rPr>
-          <w:b/>
-          <w:bCs/>
-        </w:rPr>
-        <w:t>org_id</w:t>
-      </w:r>
-      <w:proofErr w:type="spellEnd"/>
-      <w:r>
-        <w:rPr>
-          <w:b/>
-          <w:bCs/>
-        </w:rPr>
-        <w:t xml:space="preserve"> from </w:t>
-      </w:r>
-      <w:proofErr w:type="spellStart"/>
-      <w:r>
-        <w:rPr>
-          <w:b/>
-          <w:bCs/>
-        </w:rPr>
-        <w:t>organization_members</w:t>
-      </w:r>
-      <w:proofErr w:type="spellEnd"/>
-      <w:r>
-        <w:rPr>
-          <w:b/>
-          <w:bCs/>
-        </w:rPr>
-        <w:br/>
-        <w:t xml:space="preserve">    where </w:t>
-      </w:r>
-      <w:proofErr w:type="spellStart"/>
-      <w:r>
-        <w:rPr>
-          <w:b/>
-          <w:bCs/>
-        </w:rPr>
-        <w:t>user_id</w:t>
-      </w:r>
-      <w:proofErr w:type="spellEnd"/>
-      <w:r>
-        <w:rPr>
-          <w:b/>
-          <w:bCs/>
-        </w:rPr>
-        <w:t xml:space="preserve"> = </w:t>
-      </w:r>
-      <w:proofErr w:type="spellStart"/>
-      <w:proofErr w:type="gramStart"/>
-      <w:r>
-        <w:rPr>
-          <w:b/>
-          <w:bCs/>
-        </w:rPr>
-        <w:t>auth.uid</w:t>
-      </w:r>
-      <w:proofErr w:type="spellEnd"/>
-      <w:r>
-        <w:rPr>
-          <w:b/>
-          <w:bCs/>
-        </w:rPr>
-        <w:t>(</w:t>
-      </w:r>
-      <w:proofErr w:type="gramEnd"/>
-      <w:r>
-        <w:rPr>
-          <w:b/>
-          <w:bCs/>
-        </w:rPr>
-        <w:t>)</w:t>
+        <w:t xml:space="preserve">    select org_id from organization_members</w:t>
+      </w:r>
+      <w:r>
+        <w:rPr>
+          <w:b/>
+          <w:bCs/>
+        </w:rPr>
+        <w:br/>
+        <w:t xml:space="preserve">    where user_id = auth.uid()</w:t>
       </w:r>
       <w:r>
         <w:rPr>
@@ -3089,7 +1611,7 @@
           <w:bCs/>
         </w:rPr>
         <w:pict w14:anchorId="6C90F8AE">
-          <v:rect id="_x0000_i1093" style="width:0;height:1.5pt" o:hralign="center" o:hrstd="t" o:hr="t" fillcolor="#a0a0a0" stroked="f"/>
+          <v:rect id="_x0000_i1033" style="width:0;height:1.5pt" o:hralign="center" o:hrstd="t" o:hr="t" fillcolor="#a0a0a0" stroked="f"/>
         </w:pict>
       </w:r>
     </w:p>
@@ -3159,105 +1681,23 @@
           <w:bCs/>
         </w:rPr>
         <w:br/>
-        <w:t xml:space="preserve">  </w:t>
-      </w:r>
-      <w:proofErr w:type="spellStart"/>
-      <w:r>
-        <w:rPr>
-          <w:b/>
-          <w:bCs/>
-        </w:rPr>
-        <w:t>org_id</w:t>
-      </w:r>
-      <w:proofErr w:type="spellEnd"/>
-      <w:r>
-        <w:rPr>
-          <w:b/>
-          <w:bCs/>
-        </w:rPr>
-        <w:t xml:space="preserve"> in (</w:t>
-      </w:r>
-      <w:r>
-        <w:rPr>
-          <w:b/>
-          <w:bCs/>
-        </w:rPr>
-        <w:br/>
-        <w:t xml:space="preserve">    select </w:t>
-      </w:r>
-      <w:proofErr w:type="spellStart"/>
-      <w:r>
-        <w:rPr>
-          <w:b/>
-          <w:bCs/>
-        </w:rPr>
-        <w:t>org_id</w:t>
-      </w:r>
-      <w:proofErr w:type="spellEnd"/>
-      <w:r>
-        <w:rPr>
-          <w:b/>
-          <w:bCs/>
-        </w:rPr>
-        <w:t xml:space="preserve"> from </w:t>
-      </w:r>
-      <w:proofErr w:type="spellStart"/>
-      <w:r>
-        <w:rPr>
-          <w:b/>
-          <w:bCs/>
-        </w:rPr>
-        <w:t>organization_members</w:t>
-      </w:r>
-      <w:proofErr w:type="spellEnd"/>
-      <w:r>
-        <w:rPr>
-          <w:b/>
-          <w:bCs/>
-        </w:rPr>
-        <w:br/>
-        <w:t xml:space="preserve">    where </w:t>
-      </w:r>
-      <w:proofErr w:type="spellStart"/>
-      <w:r>
-        <w:rPr>
-          <w:b/>
-          <w:bCs/>
-        </w:rPr>
-        <w:t>user_id</w:t>
-      </w:r>
-      <w:proofErr w:type="spellEnd"/>
-      <w:r>
-        <w:rPr>
-          <w:b/>
-          <w:bCs/>
-        </w:rPr>
-        <w:t xml:space="preserve"> = </w:t>
-      </w:r>
-      <w:proofErr w:type="spellStart"/>
-      <w:proofErr w:type="gramStart"/>
-      <w:r>
-        <w:rPr>
-          <w:b/>
-          <w:bCs/>
-        </w:rPr>
-        <w:t>auth.uid</w:t>
-      </w:r>
-      <w:proofErr w:type="spellEnd"/>
-      <w:r>
-        <w:rPr>
-          <w:b/>
-          <w:bCs/>
-        </w:rPr>
-        <w:t>(</w:t>
-      </w:r>
-      <w:proofErr w:type="gramEnd"/>
-      <w:r>
-        <w:rPr>
-          <w:b/>
-          <w:bCs/>
-        </w:rPr>
-        <w:t>)</w:t>
+        <w:t xml:space="preserve">  org_id in (</w:t>
+      </w:r>
+      <w:r>
+        <w:rPr>
+          <w:b/>
+          <w:bCs/>
+        </w:rPr>
+        <w:br/>
+        <w:t xml:space="preserve">    select org_id from organization_members</w:t>
+      </w:r>
+      <w:r>
+        <w:rPr>
+          <w:b/>
+          <w:bCs/>
+        </w:rPr>
+        <w:br/>
+        <w:t xml:space="preserve">    where user_id = auth.uid()</w:t>
       </w:r>
       <w:r>
         <w:rPr>
@@ -3289,7 +1729,7 @@
           <w:bCs/>
         </w:rPr>
         <w:pict w14:anchorId="10A119BC">
-          <v:rect id="_x0000_i1094" style="width:0;height:1.5pt" o:hralign="center" o:hrstd="t" o:hr="t" fillcolor="#a0a0a0" stroked="f"/>
+          <v:rect id="_x0000_i1034" style="width:0;height:1.5pt" o:hralign="center" o:hrstd="t" o:hr="t" fillcolor="#a0a0a0" stroked="f"/>
         </w:pict>
       </w:r>
     </w:p>
@@ -3320,23 +1760,7 @@
           <w:b/>
           <w:bCs/>
         </w:rPr>
-        <w:t xml:space="preserve">alter table </w:t>
-      </w:r>
-      <w:proofErr w:type="spellStart"/>
-      <w:r>
-        <w:rPr>
-          <w:b/>
-          <w:bCs/>
-        </w:rPr>
-        <w:t>organization_settings</w:t>
-      </w:r>
-      <w:proofErr w:type="spellEnd"/>
-      <w:r>
-        <w:rPr>
-          <w:b/>
-          <w:bCs/>
-        </w:rPr>
-        <w:t xml:space="preserve"> enable row level security;</w:t>
+        <w:t>alter table organization_settings enable row level security;</w:t>
       </w:r>
       <w:r>
         <w:rPr>
@@ -3359,23 +1783,7 @@
           <w:bCs/>
         </w:rPr>
         <w:br/>
-        <w:t xml:space="preserve">on </w:t>
-      </w:r>
-      <w:proofErr w:type="spellStart"/>
-      <w:r>
-        <w:rPr>
-          <w:b/>
-          <w:bCs/>
-        </w:rPr>
-        <w:t>organization_settings</w:t>
-      </w:r>
-      <w:proofErr w:type="spellEnd"/>
-      <w:r>
-        <w:rPr>
-          <w:b/>
-          <w:bCs/>
-        </w:rPr>
-        <w:t xml:space="preserve"> for all</w:t>
+        <w:t>on organization_settings for all</w:t>
       </w:r>
       <w:r>
         <w:rPr>
@@ -3391,105 +1799,23 @@
           <w:bCs/>
         </w:rPr>
         <w:br/>
-        <w:t xml:space="preserve">  </w:t>
-      </w:r>
-      <w:proofErr w:type="spellStart"/>
-      <w:r>
-        <w:rPr>
-          <w:b/>
-          <w:bCs/>
-        </w:rPr>
-        <w:t>org_id</w:t>
-      </w:r>
-      <w:proofErr w:type="spellEnd"/>
-      <w:r>
-        <w:rPr>
-          <w:b/>
-          <w:bCs/>
-        </w:rPr>
-        <w:t xml:space="preserve"> in (</w:t>
-      </w:r>
-      <w:r>
-        <w:rPr>
-          <w:b/>
-          <w:bCs/>
-        </w:rPr>
-        <w:br/>
-        <w:t xml:space="preserve">    select </w:t>
-      </w:r>
-      <w:proofErr w:type="spellStart"/>
-      <w:r>
-        <w:rPr>
-          <w:b/>
-          <w:bCs/>
-        </w:rPr>
-        <w:t>org_id</w:t>
-      </w:r>
-      <w:proofErr w:type="spellEnd"/>
-      <w:r>
-        <w:rPr>
-          <w:b/>
-          <w:bCs/>
-        </w:rPr>
-        <w:t xml:space="preserve"> from </w:t>
-      </w:r>
-      <w:proofErr w:type="spellStart"/>
-      <w:r>
-        <w:rPr>
-          <w:b/>
-          <w:bCs/>
-        </w:rPr>
-        <w:t>organization_members</w:t>
-      </w:r>
-      <w:proofErr w:type="spellEnd"/>
-      <w:r>
-        <w:rPr>
-          <w:b/>
-          <w:bCs/>
-        </w:rPr>
-        <w:br/>
-        <w:t xml:space="preserve">    where </w:t>
-      </w:r>
-      <w:proofErr w:type="spellStart"/>
-      <w:r>
-        <w:rPr>
-          <w:b/>
-          <w:bCs/>
-        </w:rPr>
-        <w:t>user_id</w:t>
-      </w:r>
-      <w:proofErr w:type="spellEnd"/>
-      <w:r>
-        <w:rPr>
-          <w:b/>
-          <w:bCs/>
-        </w:rPr>
-        <w:t xml:space="preserve"> = </w:t>
-      </w:r>
-      <w:proofErr w:type="spellStart"/>
-      <w:proofErr w:type="gramStart"/>
-      <w:r>
-        <w:rPr>
-          <w:b/>
-          <w:bCs/>
-        </w:rPr>
-        <w:t>auth.uid</w:t>
-      </w:r>
-      <w:proofErr w:type="spellEnd"/>
-      <w:r>
-        <w:rPr>
-          <w:b/>
-          <w:bCs/>
-        </w:rPr>
-        <w:t>(</w:t>
-      </w:r>
-      <w:proofErr w:type="gramEnd"/>
-      <w:r>
-        <w:rPr>
-          <w:b/>
-          <w:bCs/>
-        </w:rPr>
-        <w:t>)</w:t>
+        <w:t xml:space="preserve">  org_id in (</w:t>
+      </w:r>
+      <w:r>
+        <w:rPr>
+          <w:b/>
+          <w:bCs/>
+        </w:rPr>
+        <w:br/>
+        <w:t xml:space="preserve">    select org_id from organization_members</w:t>
+      </w:r>
+      <w:r>
+        <w:rPr>
+          <w:b/>
+          <w:bCs/>
+        </w:rPr>
+        <w:br/>
+        <w:t xml:space="preserve">    where user_id = auth.uid()</w:t>
       </w:r>
       <w:r>
         <w:rPr>
@@ -3516,6 +1842,146 @@
           <w:lang w:val="en-US"/>
         </w:rPr>
       </w:pPr>
+    </w:p>
+    <w:p>
+      <w:pPr>
+        <w:rPr>
+          <w:b/>
+          <w:bCs/>
+          <w:lang w:val="en-US"/>
+        </w:rPr>
+      </w:pPr>
+    </w:p>
+    <w:p>
+      <w:pPr>
+        <w:rPr>
+          <w:b/>
+          <w:bCs/>
+          <w:lang w:val="en-US"/>
+        </w:rPr>
+      </w:pPr>
+    </w:p>
+    <w:p>
+      <w:pPr>
+        <w:rPr>
+          <w:b/>
+          <w:bCs/>
+          <w:lang w:val="en-US"/>
+        </w:rPr>
+      </w:pPr>
+    </w:p>
+    <w:p>
+      <w:pPr>
+        <w:rPr>
+          <w:b/>
+          <w:bCs/>
+          <w:lang w:val="en-US"/>
+        </w:rPr>
+      </w:pPr>
+    </w:p>
+    <w:p>
+      <w:pPr>
+        <w:rPr>
+          <w:b/>
+          <w:bCs/>
+          <w:lang w:val="en-US"/>
+        </w:rPr>
+      </w:pPr>
+    </w:p>
+    <w:p>
+      <w:pPr>
+        <w:rPr>
+          <w:b/>
+          <w:bCs/>
+          <w:lang w:val="en-US"/>
+        </w:rPr>
+      </w:pPr>
+    </w:p>
+    <w:p>
+      <w:pPr>
+        <w:rPr>
+          <w:b/>
+          <w:bCs/>
+          <w:lang w:val="en-US"/>
+        </w:rPr>
+      </w:pPr>
+    </w:p>
+    <w:p>
+      <w:pPr>
+        <w:rPr>
+          <w:b/>
+          <w:bCs/>
+          <w:lang w:val="en-US"/>
+        </w:rPr>
+      </w:pPr>
+    </w:p>
+    <w:p>
+      <w:pPr>
+        <w:rPr>
+          <w:b/>
+          <w:bCs/>
+          <w:lang w:val="en-US"/>
+        </w:rPr>
+      </w:pPr>
+      <w:r>
+        <w:rPr>
+          <w:b/>
+          <w:bCs/>
+          <w:lang w:val="en-US"/>
+        </w:rPr>
+        <w:t>May 1, 2026</w:t>
+      </w:r>
+    </w:p>
+    <w:p>
+      <w:pPr>
+        <w:rPr>
+          <w:b/>
+          <w:bCs/>
+          <w:lang w:val="en-US"/>
+        </w:rPr>
+      </w:pPr>
+      <w:r>
+        <w:rPr>
+          <w:b/>
+          <w:bCs/>
+          <w:lang w:val="en-US"/>
+        </w:rPr>
+        <w:drawing>
+          <wp:inline distT="0" distB="0" distL="0" distR="0" wp14:anchorId="16FCEB6E" wp14:editId="061F47D1">
+            <wp:extent cx="5943600" cy="2661920"/>
+            <wp:effectExtent l="0" t="0" r="0" b="5080"/>
+            <wp:docPr id="59467277" name="Picture 1"/>
+            <wp:cNvGraphicFramePr>
+              <a:graphicFrameLocks xmlns:a="http://schemas.openxmlformats.org/drawingml/2006/main" noChangeAspect="1"/>
+            </wp:cNvGraphicFramePr>
+            <a:graphic xmlns:a="http://schemas.openxmlformats.org/drawingml/2006/main">
+              <a:graphicData uri="http://schemas.openxmlformats.org/drawingml/2006/picture">
+                <pic:pic xmlns:pic="http://schemas.openxmlformats.org/drawingml/2006/picture">
+                  <pic:nvPicPr>
+                    <pic:cNvPr id="59467277" name=""/>
+                    <pic:cNvPicPr/>
+                  </pic:nvPicPr>
+                  <pic:blipFill>
+                    <a:blip r:embed="rId5"/>
+                    <a:stretch>
+                      <a:fillRect/>
+                    </a:stretch>
+                  </pic:blipFill>
+                  <pic:spPr>
+                    <a:xfrm>
+                      <a:off x="0" y="0"/>
+                      <a:ext cx="5943600" cy="2661920"/>
+                    </a:xfrm>
+                    <a:prstGeom prst="rect">
+                      <a:avLst/>
+                    </a:prstGeom>
+                  </pic:spPr>
+                </pic:pic>
+              </a:graphicData>
+            </a:graphic>
+          </wp:inline>
+        </w:drawing>
+      </w:r>
     </w:p>
     <w:sectPr>
       <w:pgSz w:w="12240" w:h="15840"/>
@@ -4287,6 +2753,7 @@
   <w:style w:type="character" w:default="1" w:styleId="DefaultParagraphFont">
     <w:name w:val="Default Paragraph Font"/>
     <w:uiPriority w:val="1"/>
+    <w:semiHidden/>
     <w:unhideWhenUsed/>
   </w:style>
   <w:style w:type="table" w:default="1" w:styleId="TableNormal">

</xml_diff>